<commit_message>
add game design document
</commit_message>
<xml_diff>
--- a/CT60A5103 Software Engineering Models and Modeling/Topic 4/submission/submission Topic 4 Assignment.docx
+++ b/CT60A5103 Software Engineering Models and Modeling/Topic 4/submission/submission Topic 4 Assignment.docx
@@ -1,13 +1,13 @@
 
 <file path=word/document.xml><?xml version="1.0" encoding="utf-8"?>
-<w:document xmlns:wpc="http://schemas.microsoft.com/office/word/2010/wordprocessingCanvas" xmlns:cx="http://schemas.microsoft.com/office/drawing/2014/chartex" xmlns:cx1="http://schemas.microsoft.com/office/drawing/2015/9/8/chartex" xmlns:cx2="http://schemas.microsoft.com/office/drawing/2015/10/21/chartex" xmlns:cx3="http://schemas.microsoft.com/office/drawing/2016/5/9/chartex" xmlns:cx4="http://schemas.microsoft.com/office/drawing/2016/5/10/chartex" xmlns:cx5="http://schemas.microsoft.com/office/drawing/2016/5/11/chartex" xmlns:cx6="http://schemas.microsoft.com/office/drawing/2016/5/12/chartex" xmlns:cx7="http://schemas.microsoft.com/office/drawing/2016/5/13/chartex" xmlns:cx8="http://schemas.microsoft.com/office/drawing/2016/5/14/chartex" xmlns:mc="http://schemas.openxmlformats.org/markup-compatibility/2006" xmlns:m="http://schemas.openxmlformats.org/officeDocument/2006/math" xmlns:aink="http://schemas.microsoft.com/office/drawing/2016/ink" xmlns:am3d="http://schemas.microsoft.com/office/drawing/2017/model3d" xmlns:oel="http://schemas.microsoft.com/office/2019/extlst" xmlns:r="http://schemas.openxmlformats.org/officeDocument/2006/relationships" xmlns:wp14="http://schemas.microsoft.com/office/word/2010/wordprocessingDrawing" xmlns:wp="http://schemas.openxmlformats.org/drawingml/2006/wordprocessingDrawing" xmlns:wpg="http://schemas.microsoft.com/office/word/2010/wordprocessingGroup" xmlns:wpi="http://schemas.microsoft.com/office/word/2010/wordprocessingInk" xmlns:wps="http://schemas.microsoft.com/office/word/2010/wordprocessingShape" xmlns:o="urn:schemas-microsoft-com:office:office" xmlns:v="urn:schemas-microsoft-com:vml" xmlns:w10="urn:schemas-microsoft-com:office:word" xmlns:w="http://schemas.openxmlformats.org/wordprocessingml/2006/main" xmlns:w14="http://schemas.microsoft.com/office/word/2010/wordml" xmlns:w15="http://schemas.microsoft.com/office/word/2012/wordml" xmlns:w16cex="http://schemas.microsoft.com/office/word/2018/wordml/cex" xmlns:w16cid="http://schemas.microsoft.com/office/word/2016/wordml/cid" xmlns:w16="http://schemas.microsoft.com/office/word/2018/wordml" xmlns:w16sdtdh="http://schemas.microsoft.com/office/word/2020/wordml/sdtdatahash" xmlns:w16sdtfl="http://schemas.microsoft.com/office/word/2024/wordml/sdtformatlock" xmlns:w16se="http://schemas.microsoft.com/office/word/2015/wordml/symex" xmlns:w16du="http://schemas.microsoft.com/office/word/2023/wordml/word16du" xmlns:wne="http://schemas.microsoft.com/office/word/2006/wordml" mc:Ignorable="w14 w15 w16se w16cid w16 w16cex w16sdtdh w16sdtfl w16du wp14">
+<w:document xmlns:wpc="http://schemas.microsoft.com/office/word/2010/wordprocessingCanvas" xmlns:cx="http://schemas.microsoft.com/office/drawing/2014/chartex" xmlns:cx1="http://schemas.microsoft.com/office/drawing/2015/9/8/chartex" xmlns:cx2="http://schemas.microsoft.com/office/drawing/2015/10/21/chartex" xmlns:cx3="http://schemas.microsoft.com/office/drawing/2016/5/9/chartex" xmlns:cx4="http://schemas.microsoft.com/office/drawing/2016/5/10/chartex" xmlns:cx5="http://schemas.microsoft.com/office/drawing/2016/5/11/chartex" xmlns:cx6="http://schemas.microsoft.com/office/drawing/2016/5/12/chartex" xmlns:cx7="http://schemas.microsoft.com/office/drawing/2016/5/13/chartex" xmlns:cx8="http://schemas.microsoft.com/office/drawing/2016/5/14/chartex" xmlns:mc="http://schemas.openxmlformats.org/markup-compatibility/2006" xmlns:m="http://schemas.openxmlformats.org/officeDocument/2006/math" xmlns:aink="http://schemas.microsoft.com/office/drawing/2016/ink" xmlns:am3d="http://schemas.microsoft.com/office/drawing/2017/model3d" xmlns:oel="http://schemas.microsoft.com/office/2019/extlst" xmlns:r="http://schemas.openxmlformats.org/officeDocument/2006/relationships" xmlns:wp14="http://schemas.microsoft.com/office/word/2010/wordprocessingDrawing" xmlns:wp="http://schemas.openxmlformats.org/drawingml/2006/wordprocessingDrawing" xmlns:wpg="http://schemas.microsoft.com/office/word/2010/wordprocessingGroup" xmlns:wpi="http://schemas.microsoft.com/office/word/2010/wordprocessingInk" xmlns:wps="http://schemas.microsoft.com/office/word/2010/wordprocessingShape" xmlns:o="urn:schemas-microsoft-com:office:office" xmlns:v="urn:schemas-microsoft-com:vml" xmlns:w10="urn:schemas-microsoft-com:office:word" xmlns:w="http://schemas.openxmlformats.org/wordprocessingml/2006/main" xmlns:w14="http://schemas.microsoft.com/office/word/2010/wordml" xmlns:w15="http://schemas.microsoft.com/office/word/2012/wordml" xmlns:w16cex="http://schemas.microsoft.com/office/word/2018/wordml/cex" xmlns:w16cid="http://schemas.microsoft.com/office/word/2016/wordml/cid" xmlns:w16="http://schemas.microsoft.com/office/word/2018/wordml" xmlns:w16sdtdh="http://schemas.microsoft.com/office/word/2020/wordml/sdtdatahash" xmlns:w16sdtfl="http://schemas.microsoft.com/office/word/2024/wordml/sdtformatlock" xmlns:w16se="http://schemas.microsoft.com/office/word/2015/wordml/symex" xmlns:w16du="http://schemas.microsoft.com/office/word/2023/wordml/word16du" xmlns:wne="http://schemas.microsoft.com/office/word/2006/wordml" xmlns:a="http://schemas.openxmlformats.org/drawingml/2006/main" xmlns:pic="http://schemas.openxmlformats.org/drawingml/2006/picture" xmlns:a14="http://schemas.microsoft.com/office/drawing/2010/main" mc:Ignorable="w14 w15 w16se w16cid w16 w16cex w16sdtdh w16sdtfl w16du wp14">
   <w:body>
     <w:p>
       <w:pPr>
         <w:spacing w:before="100" w:beforeAutospacing="1" w:after="100" w:afterAutospacing="1" w:line="240" w:lineRule="auto"/>
         <w:outlineLvl w:val="0"/>
         <w:rPr>
-          <w:rFonts w:ascii="Times New Roman" w:eastAsia="Times New Roman" w:hAnsi="Times New Roman" w:cs="Times New Roman"/>
+          <w:rFonts w:ascii="Times New Roman" w:hAnsi="Times New Roman" w:eastAsia="Times New Roman" w:cs="Times New Roman"/>
           <w:b/>
           <w:bCs/>
           <w:kern w:val="36"/>
@@ -23,7 +23,7 @@
         <w:spacing w:before="100" w:beforeAutospacing="1" w:after="100" w:afterAutospacing="1" w:line="240" w:lineRule="auto"/>
         <w:outlineLvl w:val="0"/>
         <w:rPr>
-          <w:rFonts w:ascii="Times New Roman" w:eastAsia="Times New Roman" w:hAnsi="Times New Roman" w:cs="Times New Roman"/>
+          <w:rFonts w:ascii="Times New Roman" w:hAnsi="Times New Roman" w:eastAsia="Times New Roman" w:cs="Times New Roman"/>
           <w:b/>
           <w:bCs/>
           <w:kern w:val="36"/>
@@ -39,7 +39,7 @@
         <w:spacing w:before="100" w:beforeAutospacing="1" w:after="100" w:afterAutospacing="1" w:line="240" w:lineRule="auto"/>
         <w:outlineLvl w:val="0"/>
         <w:rPr>
-          <w:rFonts w:ascii="Times New Roman" w:eastAsia="Times New Roman" w:hAnsi="Times New Roman" w:cs="Times New Roman"/>
+          <w:rFonts w:ascii="Times New Roman" w:hAnsi="Times New Roman" w:eastAsia="Times New Roman" w:cs="Times New Roman"/>
           <w:b/>
           <w:bCs/>
           <w:kern w:val="36"/>
@@ -55,7 +55,7 @@
         <w:spacing w:before="100" w:beforeAutospacing="1" w:after="100" w:afterAutospacing="1" w:line="240" w:lineRule="auto"/>
         <w:outlineLvl w:val="0"/>
         <w:rPr>
-          <w:rFonts w:ascii="Times New Roman" w:eastAsia="Times New Roman" w:hAnsi="Times New Roman" w:cs="Times New Roman"/>
+          <w:rFonts w:ascii="Times New Roman" w:hAnsi="Times New Roman" w:eastAsia="Times New Roman" w:cs="Times New Roman"/>
           <w:b/>
           <w:bCs/>
           <w:kern w:val="36"/>
@@ -71,7 +71,7 @@
         <w:spacing w:before="100" w:beforeAutospacing="1" w:after="100" w:afterAutospacing="1" w:line="240" w:lineRule="auto"/>
         <w:outlineLvl w:val="0"/>
         <w:rPr>
-          <w:rFonts w:ascii="Times New Roman" w:eastAsia="Times New Roman" w:hAnsi="Times New Roman" w:cs="Times New Roman"/>
+          <w:rFonts w:ascii="Times New Roman" w:hAnsi="Times New Roman" w:eastAsia="Times New Roman" w:cs="Times New Roman"/>
           <w:b/>
           <w:bCs/>
           <w:kern w:val="36"/>
@@ -84,40 +84,39 @@
     </w:p>
     <w:p>
       <w:pPr>
-        <w:spacing w:before="100" w:beforeAutospacing="1" w:after="100" w:afterAutospacing="1" w:line="240" w:lineRule="auto"/>
-        <w:rPr>
-          <w:rFonts w:ascii="Times New Roman" w:eastAsia="Times New Roman" w:hAnsi="Times New Roman" w:cs="Times New Roman"/>
-          <w:b/>
-          <w:bCs/>
+        <w:spacing w:before="100" w:beforeAutospacing="on" w:after="100" w:afterAutospacing="on" w:line="240" w:lineRule="auto"/>
+        <w:rPr>
+          <w:rFonts w:ascii="Times New Roman" w:hAnsi="Times New Roman" w:eastAsia="Times New Roman" w:cs="Times New Roman"/>
+          <w:b w:val="1"/>
+          <w:bCs w:val="1"/>
           <w:kern w:val="36"/>
-          <w:sz w:val="48"/>
-          <w:szCs w:val="48"/>
+          <w:sz w:val="72"/>
+          <w:szCs w:val="72"/>
           <w:lang w:val="en-US" w:eastAsia="fi-FI"/>
           <w14:ligatures w14:val="none"/>
         </w:rPr>
       </w:pPr>
       <w:r>
         <w:rPr>
-          <w:rFonts w:ascii="Times New Roman" w:eastAsia="Times New Roman" w:hAnsi="Times New Roman" w:cs="Times New Roman"/>
-          <w:b/>
-          <w:bCs/>
+          <w:rFonts w:ascii="Times New Roman" w:hAnsi="Times New Roman" w:eastAsia="Times New Roman" w:cs="Times New Roman"/>
+          <w:b w:val="1"/>
+          <w:bCs w:val="1"/>
           <w:kern w:val="36"/>
-          <w:sz w:val="48"/>
-          <w:szCs w:val="48"/>
+          <w:sz w:val="72"/>
+          <w:szCs w:val="72"/>
           <w:lang w:val="en-US" w:eastAsia="fi-FI"/>
           <w14:ligatures w14:val="none"/>
         </w:rPr>
         <w:t xml:space="preserve">Topic 4 </w:t>
       </w:r>
-      <w:proofErr w:type="spellStart"/>
-      <w:r>
-        <w:rPr>
-          <w:rFonts w:ascii="Times New Roman" w:eastAsia="Times New Roman" w:hAnsi="Times New Roman" w:cs="Times New Roman"/>
-          <w:b/>
-          <w:bCs/>
+      <w:r>
+        <w:rPr>
+          <w:rFonts w:ascii="Times New Roman" w:hAnsi="Times New Roman" w:eastAsia="Times New Roman" w:cs="Times New Roman"/>
+          <w:b w:val="1"/>
+          <w:bCs w:val="1"/>
           <w:kern w:val="36"/>
-          <w:sz w:val="48"/>
-          <w:szCs w:val="48"/>
+          <w:sz w:val="72"/>
+          <w:szCs w:val="72"/>
           <w:lang w:val="en-US" w:eastAsia="fi-FI"/>
           <w14:ligatures w14:val="none"/>
         </w:rPr>
@@ -126,117 +125,193 @@
     </w:p>
     <w:p>
       <w:pPr>
-        <w:spacing w:before="100" w:beforeAutospacing="1" w:after="100" w:afterAutospacing="1" w:line="240" w:lineRule="auto"/>
+        <w:spacing w:beforeAutospacing="on" w:afterAutospacing="on" w:line="240" w:lineRule="auto"/>
+        <w:rPr>
+          <w:rFonts w:ascii="Times New Roman" w:hAnsi="Times New Roman" w:eastAsia="Times New Roman" w:cs="Times New Roman"/>
+          <w:b w:val="1"/>
+          <w:bCs w:val="1"/>
+          <w:sz w:val="36"/>
+          <w:szCs w:val="36"/>
+          <w:lang w:val="en-US" w:eastAsia="fi-FI"/>
+        </w:rPr>
+      </w:pPr>
+    </w:p>
+    <w:p>
+      <w:pPr>
+        <w:spacing w:beforeAutospacing="on" w:afterAutospacing="on" w:line="240" w:lineRule="auto"/>
+        <w:rPr>
+          <w:rFonts w:ascii="Times New Roman" w:hAnsi="Times New Roman" w:eastAsia="Times New Roman" w:cs="Times New Roman"/>
+          <w:b w:val="1"/>
+          <w:bCs w:val="1"/>
+          <w:sz w:val="36"/>
+          <w:szCs w:val="36"/>
+          <w:lang w:val="en-US" w:eastAsia="fi-FI"/>
+        </w:rPr>
+      </w:pPr>
+    </w:p>
+    <w:p>
+      <w:pPr>
+        <w:spacing w:beforeAutospacing="on" w:afterAutospacing="on" w:line="240" w:lineRule="auto"/>
+        <w:rPr>
+          <w:rFonts w:ascii="Times New Roman" w:hAnsi="Times New Roman" w:eastAsia="Times New Roman" w:cs="Times New Roman"/>
+          <w:b w:val="1"/>
+          <w:bCs w:val="1"/>
+          <w:sz w:val="36"/>
+          <w:szCs w:val="36"/>
+          <w:lang w:val="en-US" w:eastAsia="fi-FI"/>
+        </w:rPr>
+      </w:pPr>
+    </w:p>
+    <w:p>
+      <w:pPr>
+        <w:spacing w:beforeAutospacing="on" w:afterAutospacing="on" w:line="240" w:lineRule="auto"/>
+        <w:rPr>
+          <w:rFonts w:ascii="Times New Roman" w:hAnsi="Times New Roman" w:eastAsia="Times New Roman" w:cs="Times New Roman"/>
+          <w:b w:val="1"/>
+          <w:bCs w:val="1"/>
+          <w:sz w:val="36"/>
+          <w:szCs w:val="36"/>
+          <w:lang w:val="en-US" w:eastAsia="fi-FI"/>
+        </w:rPr>
+      </w:pPr>
+    </w:p>
+    <w:p>
+      <w:pPr>
+        <w:spacing w:beforeAutospacing="on" w:afterAutospacing="on" w:line="240" w:lineRule="auto"/>
+        <w:rPr>
+          <w:rFonts w:ascii="Times New Roman" w:hAnsi="Times New Roman" w:eastAsia="Times New Roman" w:cs="Times New Roman"/>
+          <w:b w:val="1"/>
+          <w:bCs w:val="1"/>
+          <w:sz w:val="36"/>
+          <w:szCs w:val="36"/>
+          <w:lang w:val="en-US" w:eastAsia="fi-FI"/>
+        </w:rPr>
+      </w:pPr>
+    </w:p>
+    <w:p>
+      <w:pPr>
+        <w:spacing w:before="100" w:beforeAutospacing="on" w:after="100" w:afterAutospacing="on" w:line="240" w:lineRule="auto"/>
+      </w:pPr>
+      <w:r>
+        <w:rPr>
+          <w:rFonts w:ascii="Times New Roman" w:hAnsi="Times New Roman" w:eastAsia="Times New Roman" w:cs="Times New Roman"/>
+          <w:b w:val="1"/>
+          <w:bCs w:val="1"/>
+          <w:kern w:val="0"/>
+          <w:sz w:val="36"/>
+          <w:szCs w:val="36"/>
+          <w:lang w:val="en-US" w:eastAsia="fi-FI"/>
+          <w14:ligatures w14:val="none"/>
+        </w:rPr>
+        <w:t>Student name</w:t>
+      </w:r>
+    </w:p>
+    <w:p>
+      <w:pPr>
+        <w:spacing w:before="100" w:beforeAutospacing="on" w:after="100" w:afterAutospacing="on" w:line="240" w:lineRule="auto"/>
+        <w:rPr>
+          <w:rFonts w:ascii="Times New Roman" w:hAnsi="Times New Roman" w:eastAsia="Times New Roman" w:cs="Times New Roman"/>
+          <w:sz w:val="28"/>
+          <w:szCs w:val="28"/>
+          <w:lang w:val="en-US" w:eastAsia="fi-FI"/>
+        </w:rPr>
+      </w:pPr>
+      <w:r>
         <w:rPr>
           <w:rFonts w:ascii="Times New Roman" w:hAnsi="Times New Roman" w:cs="Times New Roman"/>
-          <w:b/>
-          <w:bCs/>
+          <w:sz w:val="28"/>
+          <w:szCs w:val="28"/>
+          <w:lang w:val="en-US"/>
+        </w:rPr>
+        <w:t>Hyechan Shin</w:t>
+      </w:r>
+    </w:p>
+    <w:p>
+      <w:pPr>
+        <w:spacing w:before="100" w:beforeAutospacing="on" w:after="100" w:afterAutospacing="on" w:line="240" w:lineRule="auto"/>
+        <w:rPr>
+          <w:rFonts w:ascii="Times New Roman" w:hAnsi="Times New Roman" w:cs="Times New Roman"/>
+          <w:b w:val="1"/>
+          <w:bCs w:val="1"/>
           <w:kern w:val="0"/>
           <w:lang w:val="en-US"/>
           <w14:ligatures w14:val="none"/>
         </w:rPr>
       </w:pPr>
-      <w:proofErr w:type="spellEnd"/>
-      <w:r>
-        <w:rPr>
-          <w:rFonts w:ascii="Times New Roman" w:eastAsia="Times New Roman" w:hAnsi="Times New Roman" w:cs="Times New Roman"/>
+      <w:r>
+        <w:rPr>
+          <w:rFonts w:ascii="Times New Roman" w:hAnsi="Times New Roman" w:eastAsia="Times New Roman" w:cs="Times New Roman"/>
+          <w:sz w:val="28"/>
+          <w:szCs w:val="28"/>
+          <w:lang w:val="en-US" w:eastAsia="fi-FI"/>
+        </w:rPr>
+        <w:t>Robert Gabrielsson</w:t>
+      </w:r>
+      <w:r>
+        <w:br/>
+      </w:r>
+    </w:p>
+    <w:p>
+      <w:pPr>
+        <w:tabs>
+          <w:tab w:val="left" w:pos="3453"/>
+        </w:tabs>
+        <w:rPr>
+          <w:rFonts w:asciiTheme="majorHAnsi" w:hAnsiTheme="majorHAnsi" w:eastAsiaTheme="majorEastAsia" w:cstheme="majorBidi"/>
+          <w:color w:val="0F4761" w:themeColor="accent1" w:themeShade="BF"/>
+          <w:sz w:val="40"/>
+          <w:szCs w:val="40"/>
+          <w:lang w:val="en-US"/>
+        </w:rPr>
+      </w:pPr>
+      <w:r>
+        <w:rPr>
+          <w:rFonts w:asciiTheme="majorHAnsi" w:hAnsiTheme="majorHAnsi" w:eastAsiaTheme="majorEastAsia" w:cstheme="majorBidi"/>
+          <w:color w:val="0F4761" w:themeColor="accent1" w:themeShade="BF"/>
+          <w:sz w:val="40"/>
+          <w:szCs w:val="40"/>
+          <w:lang w:val="en-US"/>
+        </w:rPr>
+        <w:tab/>
+      </w:r>
+    </w:p>
+    <w:p>
+      <w:pPr>
+        <w:tabs>
+          <w:tab w:val="left" w:pos="3453"/>
+        </w:tabs>
+        <w:rPr>
+          <w:rFonts w:ascii="Times New Roman" w:hAnsi="Times New Roman" w:eastAsia="Times New Roman" w:cs="Times New Roman"/>
           <w:b/>
           <w:bCs/>
           <w:kern w:val="0"/>
           <w:lang w:val="en-US" w:eastAsia="fi-FI"/>
           <w14:ligatures w14:val="none"/>
         </w:rPr>
-        <w:t>Student name:</w:t>
-      </w:r>
-      <w:r>
-        <w:rPr>
-          <w:rFonts w:ascii="Times New Roman" w:hAnsi="Times New Roman" w:cs="Times New Roman" w:hint="eastAsia"/>
-          <w:kern w:val="0"/>
-          <w:lang w:val="en-US"/>
-          <w14:ligatures w14:val="none"/>
-        </w:rPr>
-        <w:t xml:space="preserve"> Hyechan Shin</w:t>
-      </w:r>
-      <w:r>
-        <w:rPr>
-          <w:rFonts w:ascii="Times New Roman" w:eastAsia="Times New Roman" w:hAnsi="Times New Roman" w:cs="Times New Roman"/>
-          <w:kern w:val="0"/>
+      </w:pPr>
+      <w:r>
+        <w:rPr>
+          <w:rFonts w:ascii="Times New Roman" w:hAnsi="Times New Roman" w:eastAsia="Times New Roman" w:cs="Times New Roman"/>
           <w:lang w:val="en-US" w:eastAsia="fi-FI"/>
-          <w14:ligatures w14:val="none"/>
-        </w:rPr>
-        <w:t>, Robert Gabrielsson</w:t>
-      </w:r>
-      <w:r>
-        <w:rPr>
-          <w:rFonts w:ascii="Times New Roman" w:eastAsia="Times New Roman" w:hAnsi="Times New Roman" w:cs="Times New Roman"/>
-          <w:kern w:val="0"/>
-          <w:lang w:val="en-US" w:eastAsia="fi-FI"/>
-          <w14:ligatures w14:val="none"/>
-        </w:rPr>
-        <w:br/>
-      </w:r>
-    </w:p>
-    <w:p>
-      <w:pPr>
-        <w:tabs>
-          <w:tab w:val="left" w:pos="3453"/>
-        </w:tabs>
-        <w:rPr>
-          <w:rFonts w:asciiTheme="majorHAnsi" w:eastAsiaTheme="majorEastAsia" w:hAnsiTheme="majorHAnsi" w:cstheme="majorBidi"/>
-          <w:color w:val="0F4761" w:themeColor="accent1" w:themeShade="BF"/>
-          <w:sz w:val="40"/>
-          <w:szCs w:val="40"/>
-          <w:lang w:val="en-US"/>
-        </w:rPr>
-      </w:pPr>
-      <w:r>
-        <w:rPr>
-          <w:rFonts w:asciiTheme="majorHAnsi" w:eastAsiaTheme="majorEastAsia" w:hAnsiTheme="majorHAnsi" w:cstheme="majorBidi"/>
-          <w:color w:val="0F4761" w:themeColor="accent1" w:themeShade="BF"/>
-          <w:sz w:val="40"/>
-          <w:szCs w:val="40"/>
-          <w:lang w:val="en-US"/>
-        </w:rPr>
-        <w:tab/>
-      </w:r>
-    </w:p>
-    <w:p>
-      <w:pPr>
-        <w:tabs>
-          <w:tab w:val="left" w:pos="3453"/>
-        </w:tabs>
-        <w:rPr>
-          <w:rFonts w:ascii="Times New Roman" w:eastAsia="Times New Roman" w:hAnsi="Times New Roman" w:cs="Times New Roman"/>
+        </w:rPr>
+        <w:br w:type="page"/>
+      </w:r>
+      <w:r>
+        <w:rPr>
+          <w:rFonts w:ascii="Times New Roman" w:hAnsi="Times New Roman" w:eastAsia="Times New Roman" w:cs="Times New Roman"/>
           <w:b/>
           <w:bCs/>
           <w:kern w:val="0"/>
           <w:lang w:val="en-US" w:eastAsia="fi-FI"/>
           <w14:ligatures w14:val="none"/>
         </w:rPr>
-      </w:pPr>
-      <w:r>
-        <w:rPr>
-          <w:rFonts w:ascii="Times New Roman" w:eastAsia="Times New Roman" w:hAnsi="Times New Roman" w:cs="Times New Roman"/>
-          <w:lang w:val="en-US" w:eastAsia="fi-FI"/>
-        </w:rPr>
-        <w:br w:type="page"/>
-      </w:r>
-      <w:r>
-        <w:rPr>
-          <w:rFonts w:ascii="Times New Roman" w:eastAsia="Times New Roman" w:hAnsi="Times New Roman" w:cs="Times New Roman"/>
-          <w:b/>
-          <w:bCs/>
-          <w:kern w:val="0"/>
-          <w:lang w:val="en-US" w:eastAsia="fi-FI"/>
-          <w14:ligatures w14:val="none"/>
-        </w:rPr>
         <w:lastRenderedPageBreak/>
         <w:tab/>
       </w:r>
     </w:p>
     <w:p>
       <w:pPr>
-        <w:pStyle w:val="Heading1"/>
+        <w:pStyle w:val="Heading2"/>
         <w:rPr>
           <w:lang w:val="en-US"/>
         </w:rPr>
@@ -250,21 +325,458 @@
     </w:p>
     <w:p>
       <w:pPr>
-        <w:rPr>
-          <w:lang w:val="en-US"/>
-        </w:rPr>
-      </w:pPr>
-      <w:r>
-        <w:rPr>
-          <w:lang w:val="en-US"/>
-        </w:rPr>
-        <w:t>Text</w:t>
-      </w:r>
-    </w:p>
-    <w:p>
-      <w:pPr>
-        <w:rPr>
-          <w:rFonts w:asciiTheme="majorHAnsi" w:eastAsiaTheme="majorEastAsia" w:hAnsiTheme="majorHAnsi" w:cstheme="majorBidi"/>
+        <w:pStyle w:val="Normal"/>
+        <w:suppressLineNumbers w:val="0"/>
+        <w:bidi w:val="0"/>
+        <w:spacing w:before="0" w:beforeAutospacing="off" w:after="160" w:afterAutospacing="off" w:line="278" w:lineRule="auto"/>
+        <w:ind w:left="0" w:right="0"/>
+        <w:jc w:val="left"/>
+        <w:rPr>
+          <w:lang w:val="en-US"/>
+        </w:rPr>
+      </w:pPr>
+      <w:r>
+        <w:rPr>
+          <w:lang w:val="en-US"/>
+        </w:rPr>
+        <w:t>In this assignment</w:t>
+      </w:r>
+      <w:r>
+        <w:rPr>
+          <w:lang w:val="en-US"/>
+        </w:rPr>
+        <w:t>, we used the book ‘Use Case Driven Object Modeling with UML: Theory and Practice</w:t>
+      </w:r>
+      <w:r>
+        <w:rPr>
+          <w:lang w:val="en-US"/>
+        </w:rPr>
+        <w:t>’</w:t>
+      </w:r>
+      <w:r>
+        <w:rPr>
+          <w:lang w:val="en-US"/>
+        </w:rPr>
+        <w:t xml:space="preserve"> to</w:t>
+      </w:r>
+      <w:r>
+        <w:rPr>
+          <w:lang w:val="en-US"/>
+        </w:rPr>
+        <w:t xml:space="preserve"> create a simplified domain model, a use case diagram, and a robustness analysis method to produce a boundary-entity-</w:t>
+      </w:r>
+      <w:r>
+        <w:rPr>
+          <w:lang w:val="en-US"/>
+        </w:rPr>
+        <w:t>controller diagram</w:t>
+      </w:r>
+      <w:r>
+        <w:rPr>
+          <w:lang w:val="en-US"/>
+        </w:rPr>
+        <w:t xml:space="preserve"> for </w:t>
+      </w:r>
+      <w:r>
+        <w:rPr>
+          <w:lang w:val="en-US"/>
+        </w:rPr>
+        <w:t>AudioNow</w:t>
+      </w:r>
+      <w:r>
+        <w:rPr>
+          <w:lang w:val="en-US"/>
+        </w:rPr>
+        <w:t>.</w:t>
+      </w:r>
+    </w:p>
+    <w:p>
+      <w:pPr>
+        <w:pStyle w:val="Normal"/>
+        <w:suppressLineNumbers w:val="0"/>
+        <w:bidi w:val="0"/>
+        <w:spacing w:before="0" w:beforeAutospacing="off" w:after="160" w:afterAutospacing="off" w:line="278" w:lineRule="auto"/>
+        <w:ind w:left="0" w:right="0"/>
+        <w:jc w:val="left"/>
+        <w:rPr>
+          <w:lang w:val="en-US"/>
+        </w:rPr>
+      </w:pPr>
+    </w:p>
+    <w:p>
+      <w:pPr>
+        <w:pStyle w:val="Heading2"/>
+        <w:rPr>
+          <w:rFonts w:ascii="Aptos Display" w:hAnsi="Aptos Display" w:eastAsia="맑은 고딕" w:cs="" w:asciiTheme="majorAscii" w:hAnsiTheme="majorAscii" w:eastAsiaTheme="majorEastAsia" w:cstheme="majorBidi"/>
+          <w:color w:val="0F4761" w:themeColor="accent1" w:themeTint="FF" w:themeShade="BF"/>
+          <w:sz w:val="40"/>
+          <w:szCs w:val="40"/>
+          <w:lang w:val="en-US"/>
+        </w:rPr>
+      </w:pPr>
+      <w:r>
+        <w:rPr>
+          <w:lang w:val="en-US"/>
+        </w:rPr>
+        <w:t xml:space="preserve">Simplified </w:t>
+      </w:r>
+      <w:r>
+        <w:rPr>
+          <w:lang w:val="en-US"/>
+        </w:rPr>
+        <w:t>D</w:t>
+      </w:r>
+      <w:r>
+        <w:rPr>
+          <w:lang w:val="en-US"/>
+        </w:rPr>
+        <w:t xml:space="preserve">omain </w:t>
+      </w:r>
+      <w:r>
+        <w:rPr>
+          <w:lang w:val="en-US"/>
+        </w:rPr>
+        <w:t>M</w:t>
+      </w:r>
+      <w:r>
+        <w:rPr>
+          <w:lang w:val="en-US"/>
+        </w:rPr>
+        <w:t>odel</w:t>
+      </w:r>
+    </w:p>
+    <w:p>
+      <w:pPr>
+        <w:pStyle w:val="Normal"/>
+      </w:pPr>
+      <w:r>
+        <w:drawing>
+          <wp:inline wp14:editId="6838A951" wp14:anchorId="41D23573">
+            <wp:extent cx="5342890" cy="1733550"/>
+            <wp:effectExtent l="0" t="0" r="0" b="0"/>
+            <wp:docPr id="1946131218" name="drawing"/>
+            <wp:cNvGraphicFramePr>
+              <a:graphicFrameLocks noChangeAspect="1"/>
+            </wp:cNvGraphicFramePr>
+            <a:graphic>
+              <a:graphicData xmlns:a="http://schemas.openxmlformats.org/drawingml/2006/main" uri="http://schemas.openxmlformats.org/drawingml/2006/picture">
+                <pic:pic xmlns:pic="http://schemas.openxmlformats.org/drawingml/2006/picture">
+                  <pic:nvPicPr>
+                    <pic:cNvPr id="1946131218" name="Picture 1946131218"/>
+                    <pic:cNvPicPr/>
+                  </pic:nvPicPr>
+                  <pic:blipFill>
+                    <a:blip xmlns:r="http://schemas.openxmlformats.org/officeDocument/2006/relationships" r:embed="rId1906791051">
+                      <a:extLst>
+                        <a:ext uri="{28A0092B-C50C-407E-A947-70E740481C1C}">
+                          <a14:useLocalDpi xmlns:a14="http://schemas.microsoft.com/office/drawing/2010/main"/>
+                        </a:ext>
+                      </a:extLst>
+                    </a:blip>
+                    <a:stretch>
+                      <a:fillRect/>
+                    </a:stretch>
+                  </pic:blipFill>
+                  <pic:spPr>
+                    <a:xfrm rot="0">
+                      <a:off x="0" y="0"/>
+                      <a:ext cx="5342890" cy="1733550"/>
+                    </a:xfrm>
+                    <a:prstGeom prst="rect">
+                      <a:avLst/>
+                    </a:prstGeom>
+                  </pic:spPr>
+                </pic:pic>
+              </a:graphicData>
+            </a:graphic>
+          </wp:inline>
+        </w:drawing>
+      </w:r>
+    </w:p>
+    <w:p>
+      <w:pPr>
+        <w:pStyle w:val="Normal"/>
+        <w:suppressLineNumbers w:val="0"/>
+        <w:bidi w:val="0"/>
+        <w:spacing w:before="0" w:beforeAutospacing="off" w:after="160" w:afterAutospacing="off" w:line="278" w:lineRule="auto"/>
+        <w:ind w:left="0" w:right="0"/>
+        <w:jc w:val="left"/>
+      </w:pPr>
+      <w:r>
+        <w:rPr>
+          <w:lang w:val="en-US"/>
+        </w:rPr>
+        <w:t xml:space="preserve">The simplified domain model shows the main object of </w:t>
+      </w:r>
+      <w:r>
+        <w:rPr>
+          <w:lang w:val="en-US"/>
+        </w:rPr>
+        <w:t>AudioNow</w:t>
+      </w:r>
+      <w:r>
+        <w:rPr>
+          <w:lang w:val="en-US"/>
+        </w:rPr>
+        <w:t xml:space="preserve">. A listener </w:t>
+      </w:r>
+      <w:r>
+        <w:rPr>
+          <w:lang w:val="en-US"/>
+        </w:rPr>
+        <w:t>can</w:t>
+      </w:r>
+      <w:r>
+        <w:rPr>
+          <w:lang w:val="en-US"/>
+        </w:rPr>
+        <w:t xml:space="preserve"> have many subscriptions, and each subscription uses one plan. Each </w:t>
+      </w:r>
+      <w:r>
+        <w:rPr>
+          <w:lang w:val="en-US"/>
+        </w:rPr>
+        <w:t>subscription</w:t>
+      </w:r>
+      <w:r>
+        <w:rPr>
+          <w:lang w:val="en-US"/>
+        </w:rPr>
+        <w:t xml:space="preserve"> has one or more payments. </w:t>
+      </w:r>
+      <w:r>
+        <w:rPr>
+          <w:lang w:val="en-US"/>
+        </w:rPr>
+        <w:t>Podcasts have</w:t>
+      </w:r>
+      <w:r>
+        <w:rPr>
+          <w:lang w:val="en-US"/>
+        </w:rPr>
+        <w:t xml:space="preserve"> one or more plans, </w:t>
+      </w:r>
+      <w:r>
+        <w:rPr>
+          <w:lang w:val="en-US"/>
+        </w:rPr>
+        <w:t>one</w:t>
+      </w:r>
+      <w:r>
+        <w:rPr>
+          <w:lang w:val="en-US"/>
+        </w:rPr>
+        <w:t xml:space="preserve"> more </w:t>
+      </w:r>
+      <w:r>
+        <w:rPr>
+          <w:lang w:val="en-US"/>
+        </w:rPr>
+        <w:t>creators</w:t>
+      </w:r>
+      <w:r>
+        <w:rPr>
+          <w:lang w:val="en-US"/>
+        </w:rPr>
+        <w:t xml:space="preserve"> makes one or more podcasts.</w:t>
+      </w:r>
+      <w:r>
+        <w:rPr>
+          <w:lang w:val="en-US"/>
+        </w:rPr>
+        <w:t xml:space="preserve"> </w:t>
+      </w:r>
+      <w:r>
+        <w:rPr>
+          <w:lang w:val="en-US"/>
+        </w:rPr>
+        <w:t>The numbers on the lines show multiplicity, meaning how many objects can be linked</w:t>
+      </w:r>
+      <w:r>
+        <w:rPr>
+          <w:lang w:val="en-US"/>
+        </w:rPr>
+        <w:t xml:space="preserve"> (</w:t>
+      </w:r>
+      <w:r>
+        <w:rPr>
+          <w:lang w:val="en-US"/>
+        </w:rPr>
+        <w:t>Fowler, 2004</w:t>
+      </w:r>
+      <w:r>
+        <w:rPr>
+          <w:lang w:val="en-US"/>
+        </w:rPr>
+        <w:t>)</w:t>
+      </w:r>
+      <w:r>
+        <w:rPr>
+          <w:lang w:val="en-US"/>
+        </w:rPr>
+        <w:t>.</w:t>
+      </w:r>
+    </w:p>
+    <w:p>
+      <w:pPr>
+        <w:pStyle w:val="Heading2"/>
+        <w:rPr>
+          <w:rFonts w:ascii="Aptos Display" w:hAnsi="Aptos Display" w:eastAsia="맑은 고딕" w:cs="" w:asciiTheme="majorAscii" w:hAnsiTheme="majorAscii" w:eastAsiaTheme="majorEastAsia" w:cstheme="majorBidi"/>
+          <w:color w:val="0F4761" w:themeColor="accent1" w:themeTint="FF" w:themeShade="BF"/>
+          <w:sz w:val="40"/>
+          <w:szCs w:val="40"/>
+          <w:lang w:val="en-US"/>
+        </w:rPr>
+      </w:pPr>
+      <w:r>
+        <w:rPr>
+          <w:lang w:val="en-US"/>
+        </w:rPr>
+        <w:t xml:space="preserve">Use </w:t>
+      </w:r>
+      <w:r>
+        <w:rPr>
+          <w:lang w:val="en-US"/>
+        </w:rPr>
+        <w:t>case diagram</w:t>
+      </w:r>
+      <w:r>
+        <w:rPr>
+          <w:lang w:val="en-US"/>
+        </w:rPr>
+        <w:t xml:space="preserve"> </w:t>
+      </w:r>
+    </w:p>
+    <w:p>
+      <w:pPr>
+        <w:pStyle w:val="Normal"/>
+      </w:pPr>
+      <w:r>
+        <w:drawing>
+          <wp:inline wp14:editId="79F9B8AA" wp14:anchorId="024B573E">
+            <wp:extent cx="5724525" cy="4819650"/>
+            <wp:effectExtent l="0" t="0" r="0" b="0"/>
+            <wp:docPr id="122809119" name="drawing"/>
+            <wp:cNvGraphicFramePr>
+              <a:graphicFrameLocks noChangeAspect="1"/>
+            </wp:cNvGraphicFramePr>
+            <a:graphic>
+              <a:graphicData xmlns:a="http://schemas.openxmlformats.org/drawingml/2006/main" uri="http://schemas.openxmlformats.org/drawingml/2006/picture">
+                <pic:pic xmlns:pic="http://schemas.openxmlformats.org/drawingml/2006/picture">
+                  <pic:nvPicPr>
+                    <pic:cNvPr id="122809119" name="Picture 122809119"/>
+                    <pic:cNvPicPr/>
+                  </pic:nvPicPr>
+                  <pic:blipFill>
+                    <a:blip xmlns:r="http://schemas.openxmlformats.org/officeDocument/2006/relationships" r:embed="rId53002639">
+                      <a:extLst>
+                        <a:ext uri="{28A0092B-C50C-407E-A947-70E740481C1C}">
+                          <a14:useLocalDpi xmlns:a14="http://schemas.microsoft.com/office/drawing/2010/main"/>
+                        </a:ext>
+                      </a:extLst>
+                    </a:blip>
+                    <a:stretch>
+                      <a:fillRect/>
+                    </a:stretch>
+                  </pic:blipFill>
+                  <pic:spPr>
+                    <a:xfrm>
+                      <a:off x="0" y="0"/>
+                      <a:ext cx="5724525" cy="4819650"/>
+                    </a:xfrm>
+                    <a:prstGeom prst="rect">
+                      <a:avLst/>
+                    </a:prstGeom>
+                  </pic:spPr>
+                </pic:pic>
+              </a:graphicData>
+            </a:graphic>
+          </wp:inline>
+        </w:drawing>
+      </w:r>
+      <w:r>
+        <w:rPr>
+          <w:lang w:val="en-US"/>
+        </w:rPr>
+        <w:t xml:space="preserve">The boundary of the </w:t>
+      </w:r>
+      <w:r>
+        <w:rPr>
+          <w:lang w:val="en-US"/>
+        </w:rPr>
+        <w:t>AudioNow</w:t>
+      </w:r>
+      <w:r>
+        <w:rPr>
+          <w:lang w:val="en-US"/>
+        </w:rPr>
+        <w:t xml:space="preserve"> system is shown by the gray box, and the use case of “Buy Podcast Subscription” is </w:t>
+      </w:r>
+      <w:r>
+        <w:rPr>
+          <w:lang w:val="en-US"/>
+        </w:rPr>
+        <w:t xml:space="preserve">yellow.  </w:t>
+      </w:r>
+      <w:r>
+        <w:rPr>
+          <w:lang w:val="en-US"/>
+        </w:rPr>
+        <w:t xml:space="preserve">“Buying Podcast Subscription” is the main use case of the system, and hence, the diagram is concentrated more on this use case. The use cases "Log In" and "Pay" are </w:t>
+      </w:r>
+      <w:r>
+        <w:rPr>
+          <w:i w:val="1"/>
+          <w:iCs w:val="1"/>
+          <w:lang w:val="en-US"/>
+        </w:rPr>
+        <w:t>&lt;&lt;include&gt;&gt;</w:t>
+      </w:r>
+      <w:r>
+        <w:rPr>
+          <w:lang w:val="en-US"/>
+        </w:rPr>
+        <w:t xml:space="preserve">, </w:t>
+      </w:r>
+      <w:r>
+        <w:rPr>
+          <w:lang w:val="en-US"/>
+        </w:rPr>
+        <w:t>whereas</w:t>
+      </w:r>
+      <w:r>
+        <w:rPr>
+          <w:lang w:val="en-US"/>
+        </w:rPr>
+        <w:t xml:space="preserve"> the use case "Apply Promo Code" is </w:t>
+      </w:r>
+      <w:r>
+        <w:rPr>
+          <w:i w:val="1"/>
+          <w:iCs w:val="1"/>
+          <w:lang w:val="en-US"/>
+        </w:rPr>
+        <w:t>&lt;&lt;extend&gt;&gt;</w:t>
+      </w:r>
+      <w:r>
+        <w:rPr>
+          <w:lang w:val="en-US"/>
+        </w:rPr>
+        <w:t>, since the latter does not necessarily have to be carried out in each buying operation.</w:t>
+      </w:r>
+    </w:p>
+    <w:p>
+      <w:pPr>
+        <w:pStyle w:val="Normal"/>
+        <w:rPr>
+          <w:lang w:val="en-US"/>
+        </w:rPr>
+      </w:pPr>
+    </w:p>
+    <w:p>
+      <w:pPr>
+        <w:rPr>
+          <w:rFonts w:ascii="Aptos Display" w:hAnsi="Aptos Display" w:eastAsia="맑은 고딕" w:cs="" w:asciiTheme="majorAscii" w:hAnsiTheme="majorAscii" w:eastAsiaTheme="majorEastAsia" w:cstheme="majorBidi"/>
           <w:color w:val="0F4761" w:themeColor="accent1" w:themeShade="BF"/>
           <w:sz w:val="40"/>
           <w:szCs w:val="40"/>
@@ -273,393 +785,341 @@
       </w:pPr>
       <w:r>
         <w:rPr>
-          <w:rFonts w:asciiTheme="majorHAnsi" w:eastAsiaTheme="majorEastAsia" w:hAnsiTheme="majorHAnsi" w:cstheme="majorBidi"/>
-          <w:color w:val="0F4761" w:themeColor="accent1" w:themeShade="BF"/>
+          <w:rStyle w:val="Heading2Char"/>
+          <w:lang w:val="en-US"/>
+        </w:rPr>
+        <w:t>Robustness (BCE</w:t>
+      </w:r>
+      <w:r>
+        <w:rPr>
+          <w:rStyle w:val="Heading2Char"/>
+          <w:lang w:val="en-US"/>
+        </w:rPr>
+        <w:t xml:space="preserve"> - </w:t>
+      </w:r>
+      <w:r>
+        <w:rPr>
+          <w:rStyle w:val="Heading2Char"/>
+          <w:lang w:val="en-US"/>
+        </w:rPr>
+        <w:t>Boundary–Control–Entity</w:t>
+      </w:r>
+      <w:r>
+        <w:rPr>
+          <w:rStyle w:val="Heading2Char"/>
+          <w:lang w:val="en-US"/>
+        </w:rPr>
+        <w:t>) Diagram</w:t>
+      </w:r>
+      <w:r>
+        <w:rPr>
+          <w:rStyle w:val="Heading2Char"/>
+          <w:lang w:val="en-US"/>
+        </w:rPr>
+        <w:t xml:space="preserve"> </w:t>
+      </w:r>
+    </w:p>
+    <w:p>
+      <w:pPr>
+        <w:pStyle w:val="Normal"/>
+      </w:pPr>
+      <w:r>
+        <w:drawing>
+          <wp:inline wp14:editId="429296A8" wp14:anchorId="05C0C952">
+            <wp:extent cx="5724525" cy="2628900"/>
+            <wp:effectExtent l="0" t="0" r="0" b="0"/>
+            <wp:docPr id="1033702816" name="drawing"/>
+            <wp:cNvGraphicFramePr>
+              <a:graphicFrameLocks noChangeAspect="1"/>
+            </wp:cNvGraphicFramePr>
+            <a:graphic>
+              <a:graphicData xmlns:a="http://schemas.openxmlformats.org/drawingml/2006/main" uri="http://schemas.openxmlformats.org/drawingml/2006/picture">
+                <pic:pic xmlns:pic="http://schemas.openxmlformats.org/drawingml/2006/picture">
+                  <pic:nvPicPr>
+                    <pic:cNvPr id="1569375311" name="Picture 1569375311"/>
+                    <pic:cNvPicPr/>
+                  </pic:nvPicPr>
+                  <pic:blipFill>
+                    <a:blip xmlns:r="http://schemas.openxmlformats.org/officeDocument/2006/relationships" r:embed="rId1307405963">
+                      <a:extLst>
+                        <a:ext uri="{28A0092B-C50C-407E-A947-70E740481C1C}">
+                          <a14:useLocalDpi xmlns:a14="http://schemas.microsoft.com/office/drawing/2010/main"/>
+                        </a:ext>
+                      </a:extLst>
+                    </a:blip>
+                    <a:stretch>
+                      <a:fillRect/>
+                    </a:stretch>
+                  </pic:blipFill>
+                  <pic:spPr>
+                    <a:xfrm>
+                      <a:off x="0" y="0"/>
+                      <a:ext cx="5724525" cy="2628900"/>
+                    </a:xfrm>
+                    <a:prstGeom prst="rect">
+                      <a:avLst/>
+                    </a:prstGeom>
+                  </pic:spPr>
+                </pic:pic>
+              </a:graphicData>
+            </a:graphic>
+          </wp:inline>
+        </w:drawing>
+      </w:r>
+      <w:r>
+        <w:rPr>
+          <w:lang w:val="en-US"/>
+        </w:rPr>
+        <w:t>We drew the BCE diagram from the use case steps (Rosenberg &amp; Stephens, 2007). Screens became bounday objects, actions are control objects, entity objects is from</w:t>
+      </w:r>
+      <w:r>
+        <w:rPr>
+          <w:lang w:val="en-US"/>
+        </w:rPr>
+        <w:t xml:space="preserve"> the domain model. The number 1-7 match the use case steps.</w:t>
+      </w:r>
+    </w:p>
+    <w:p>
+      <w:pPr>
+        <w:pStyle w:val="Normal"/>
+        <w:suppressLineNumbers w:val="0"/>
+        <w:bidi w:val="0"/>
+        <w:spacing w:before="0" w:beforeAutospacing="off" w:after="160" w:afterAutospacing="off" w:line="278" w:lineRule="auto"/>
+        <w:ind w:left="0" w:right="0"/>
+        <w:jc w:val="left"/>
+        <w:rPr>
+          <w:lang w:val="en-US"/>
+        </w:rPr>
+      </w:pPr>
+    </w:p>
+    <w:p>
+      <w:pPr>
+        <w:pStyle w:val="Heading2"/>
+        <w:rPr>
+          <w:rFonts w:ascii="Aptos Display" w:hAnsi="Aptos Display" w:eastAsia="맑은 고딕" w:cs="" w:asciiTheme="majorAscii" w:hAnsiTheme="majorAscii" w:eastAsiaTheme="majorEastAsia" w:cstheme="majorBidi"/>
+          <w:color w:val="0F4761" w:themeColor="accent1" w:themeTint="FF" w:themeShade="BF"/>
           <w:sz w:val="40"/>
           <w:szCs w:val="40"/>
           <w:lang w:val="en-US"/>
         </w:rPr>
-        <w:t>create a simplified domain model based on the description written in Chapter 2.</w:t>
-      </w:r>
-    </w:p>
-    <w:p>
-      <w:pPr>
-        <w:rPr>
-          <w:lang w:val="en-US"/>
-        </w:rPr>
-      </w:pPr>
-      <w:r>
-        <w:rPr>
-          <w:lang w:val="en-US"/>
-        </w:rPr>
-        <w:t>Text</w:t>
-      </w:r>
-    </w:p>
-    <w:p>
-      <w:pPr>
-        <w:rPr>
-          <w:rFonts w:asciiTheme="majorHAnsi" w:eastAsiaTheme="majorEastAsia" w:hAnsiTheme="majorHAnsi" w:cstheme="majorBidi"/>
-          <w:color w:val="0F4761" w:themeColor="accent1" w:themeShade="BF"/>
-          <w:sz w:val="40"/>
-          <w:szCs w:val="40"/>
-          <w:lang w:val="en-US"/>
-        </w:rPr>
-      </w:pPr>
-      <w:r>
-        <w:rPr>
-          <w:rFonts w:asciiTheme="majorHAnsi" w:eastAsiaTheme="majorEastAsia" w:hAnsiTheme="majorHAnsi" w:cstheme="majorBidi"/>
-          <w:color w:val="0F4761" w:themeColor="accent1" w:themeShade="BF"/>
-          <w:sz w:val="40"/>
-          <w:szCs w:val="40"/>
-          <w:lang w:val="en-US"/>
-        </w:rPr>
-        <w:t xml:space="preserve">read Chapter 3 and draw </w:t>
-      </w:r>
-      <w:proofErr w:type="gramStart"/>
-      <w:r>
-        <w:rPr>
-          <w:rFonts w:asciiTheme="majorHAnsi" w:eastAsiaTheme="majorEastAsia" w:hAnsiTheme="majorHAnsi" w:cstheme="majorBidi"/>
-          <w:color w:val="0F4761" w:themeColor="accent1" w:themeShade="BF"/>
-          <w:sz w:val="40"/>
-          <w:szCs w:val="40"/>
-          <w:lang w:val="en-US"/>
-        </w:rPr>
-        <w:t>an</w:t>
-      </w:r>
-      <w:proofErr w:type="gramEnd"/>
-      <w:r>
-        <w:rPr>
-          <w:rFonts w:asciiTheme="majorHAnsi" w:eastAsiaTheme="majorEastAsia" w:hAnsiTheme="majorHAnsi" w:cstheme="majorBidi"/>
-          <w:color w:val="0F4761" w:themeColor="accent1" w:themeShade="BF"/>
-          <w:sz w:val="40"/>
-          <w:szCs w:val="40"/>
-          <w:lang w:val="en-US"/>
-        </w:rPr>
-        <w:t xml:space="preserve"> use case diagram. You can also review a visual paradigm tutorial on use case diagrams</w:t>
-      </w:r>
-      <w:r>
-        <w:rPr>
-          <w:rFonts w:asciiTheme="majorHAnsi" w:eastAsiaTheme="majorEastAsia" w:hAnsiTheme="majorHAnsi" w:cstheme="majorBidi"/>
-          <w:color w:val="0F4761" w:themeColor="accent1" w:themeShade="BF"/>
-          <w:sz w:val="40"/>
-          <w:szCs w:val="40"/>
+      </w:pPr>
+      <w:r>
+        <w:rPr>
+          <w:lang w:val="en-US"/>
+        </w:rPr>
+        <w:t>AI Declarations</w:t>
+      </w:r>
+    </w:p>
+    <w:p>
+      <w:pPr>
+        <w:pStyle w:val="Normal"/>
+        <w:suppressLineNumbers w:val="0"/>
+        <w:spacing w:before="0" w:beforeAutospacing="off" w:after="160" w:afterAutospacing="off" w:line="278" w:lineRule="auto"/>
+        <w:ind w:left="0" w:right="0"/>
+        <w:jc w:val="left"/>
+      </w:pPr>
+      <w:r>
+        <w:rPr>
+          <w:lang w:val="en-US"/>
+        </w:rPr>
+        <w:t xml:space="preserve">ChatGPT was </w:t>
+      </w:r>
+      <w:r>
+        <w:rPr>
+          <w:lang w:val="en-US"/>
+        </w:rPr>
+        <w:t>used</w:t>
+      </w:r>
+      <w:r>
+        <w:rPr>
           <w:lang w:val="en-US"/>
         </w:rPr>
         <w:t xml:space="preserve"> </w:t>
       </w:r>
-    </w:p>
-    <w:p>
-      <w:pPr>
-        <w:rPr>
-          <w:lang w:val="en-US"/>
-        </w:rPr>
-      </w:pPr>
-      <w:r>
-        <w:rPr>
-          <w:lang w:val="en-US"/>
-        </w:rPr>
-        <w:t>Text</w:t>
-      </w:r>
-    </w:p>
-    <w:p>
-      <w:pPr>
-        <w:rPr>
-          <w:rFonts w:asciiTheme="majorHAnsi" w:eastAsiaTheme="majorEastAsia" w:hAnsiTheme="majorHAnsi" w:cstheme="majorBidi"/>
-          <w:color w:val="0F4761" w:themeColor="accent1" w:themeShade="BF"/>
-          <w:sz w:val="40"/>
-          <w:szCs w:val="40"/>
-          <w:lang w:val="en-US"/>
-        </w:rPr>
-      </w:pPr>
-      <w:r>
-        <w:rPr>
-          <w:rFonts w:asciiTheme="majorHAnsi" w:eastAsiaTheme="majorEastAsia" w:hAnsiTheme="majorHAnsi" w:cstheme="majorBidi"/>
-          <w:color w:val="0F4761" w:themeColor="accent1" w:themeShade="BF"/>
-          <w:sz w:val="40"/>
-          <w:szCs w:val="40"/>
-          <w:lang w:val="en-US"/>
-        </w:rPr>
-        <w:t xml:space="preserve">Read chapter 5 </w:t>
-      </w:r>
-      <w:r>
-        <w:rPr>
-          <w:rFonts w:asciiTheme="majorHAnsi" w:eastAsiaTheme="majorEastAsia" w:hAnsiTheme="majorHAnsi" w:cstheme="majorBidi"/>
-          <w:color w:val="0F4761" w:themeColor="accent1" w:themeShade="BF"/>
-          <w:sz w:val="40"/>
-          <w:szCs w:val="40"/>
-          <w:lang w:val="en-US"/>
-        </w:rPr>
-        <w:t>Robustness (BCE) Diagram</w:t>
-      </w:r>
-      <w:r>
-        <w:rPr>
-          <w:rFonts w:asciiTheme="majorHAnsi" w:eastAsiaTheme="majorEastAsia" w:hAnsiTheme="majorHAnsi" w:cstheme="majorBidi"/>
-          <w:color w:val="0F4761" w:themeColor="accent1" w:themeShade="BF"/>
-          <w:sz w:val="40"/>
-          <w:szCs w:val="40"/>
-          <w:lang w:val="en-US"/>
-        </w:rPr>
-        <w:t xml:space="preserve"> </w:t>
-      </w:r>
-    </w:p>
-    <w:p>
-      <w:pPr>
-        <w:rPr>
-          <w:lang w:val="en-US"/>
-        </w:rPr>
-      </w:pPr>
-      <w:r>
-        <w:rPr>
-          <w:lang w:val="en-US"/>
-        </w:rPr>
-        <w:t>Text</w:t>
-      </w:r>
-    </w:p>
-    <w:p>
-      <w:pPr>
-        <w:rPr>
-          <w:rFonts w:asciiTheme="majorHAnsi" w:eastAsiaTheme="majorEastAsia" w:hAnsiTheme="majorHAnsi" w:cstheme="majorBidi"/>
-          <w:color w:val="0F4761" w:themeColor="accent1" w:themeShade="BF"/>
-          <w:sz w:val="40"/>
-          <w:szCs w:val="40"/>
-          <w:lang w:val="en-US"/>
-        </w:rPr>
-      </w:pPr>
-      <w:proofErr w:type="gramStart"/>
-      <w:r>
-        <w:rPr>
-          <w:rFonts w:asciiTheme="majorHAnsi" w:eastAsiaTheme="majorEastAsia" w:hAnsiTheme="majorHAnsi" w:cstheme="majorBidi"/>
-          <w:color w:val="0F4761" w:themeColor="accent1" w:themeShade="BF"/>
-          <w:sz w:val="40"/>
-          <w:szCs w:val="40"/>
-          <w:lang w:val="en-US"/>
-        </w:rPr>
-        <w:t>Optional :</w:t>
-      </w:r>
-      <w:proofErr w:type="gramEnd"/>
-      <w:r>
-        <w:rPr>
-          <w:rFonts w:asciiTheme="majorHAnsi" w:eastAsiaTheme="majorEastAsia" w:hAnsiTheme="majorHAnsi" w:cstheme="majorBidi"/>
-          <w:color w:val="0F4761" w:themeColor="accent1" w:themeShade="BF"/>
-          <w:sz w:val="40"/>
-          <w:szCs w:val="40"/>
-          <w:lang w:val="en-US"/>
-        </w:rPr>
-        <w:t xml:space="preserve"> conclusion</w:t>
-      </w:r>
-    </w:p>
-    <w:p>
-      <w:pPr>
-        <w:rPr>
-          <w:lang w:val="en-US"/>
-        </w:rPr>
-      </w:pPr>
-      <w:r>
-        <w:rPr>
-          <w:lang w:val="en-US"/>
-        </w:rPr>
-        <w:t>Text</w:t>
-      </w:r>
-    </w:p>
-    <w:p>
-      <w:r>
-        <w:br w:type="page"/>
-      </w:r>
-    </w:p>
-    <w:p>
-      <w:r>
-        <w:lastRenderedPageBreak/>
-        <w:t>About this task</w:t>
-      </w:r>
-    </w:p>
-    <w:p/>
-    <w:p>
-      <w:r>
-        <w:t>You can find the mandatory assignment description in here. On this, you work on together as a group and return as a PDF for grading using the associated Moodle assignment link.</w:t>
-      </w:r>
-    </w:p>
-    <w:p/>
-    <w:p>
-      <w:r>
-        <w:t xml:space="preserve"> </w:t>
-      </w:r>
-    </w:p>
-    <w:p/>
-    <w:p>
-      <w:r>
-        <w:t>Mandatory Assignment (topic 4, submit via Moodle as PDF)</w:t>
-      </w:r>
-    </w:p>
-    <w:p/>
-    <w:p>
-      <w:r>
-        <w:t>General requirements</w:t>
-      </w:r>
-    </w:p>
-    <w:p/>
-    <w:p>
-      <w:r>
-        <w:t>Max 2-4 pages (+1 cover page). Please concentrate on the diagrams and then explaining the rationale behind their design.</w:t>
-      </w:r>
-    </w:p>
-    <w:p/>
-    <w:p>
-      <w:r>
-        <w:t>Submit this assignment via Moodle as PDF (see the exercises and assignment page for the return link).</w:t>
-      </w:r>
-    </w:p>
-    <w:p/>
-    <w:p>
-      <w:r>
-        <w:t>Assignment description</w:t>
-      </w:r>
-    </w:p>
-    <w:p/>
-    <w:p>
-      <w:r>
-        <w:t>This week's assignment involves analyzing a system description and creating a series of UML diagrams based on the description. We start with describing use case diagrams, proceed to conceptual modeling, and finally analyze where the users interact with technological objects through BCE modeling.</w:t>
-      </w:r>
-    </w:p>
-    <w:p/>
-    <w:p>
-      <w:r>
-        <w:t>We use "Use Case Driven Object Modeling with UML: Theory and Practise" ( https://doi-org.ezproxy.cc.lut.fi/10.1007/978-1-4302-0369-8 ) as our step by step guide. It is an older edition, but the steps are well described and very clear, compared to some alternative books.</w:t>
-      </w:r>
-    </w:p>
-    <w:p/>
-    <w:p>
-      <w:r>
-        <w:lastRenderedPageBreak/>
-        <w:t>First step, read the deliverables listed and then then case description. Then, create a simplified domain model based on the description written in Chapter 2.</w:t>
-      </w:r>
-    </w:p>
-    <w:p/>
-    <w:p>
-      <w:r>
-        <w:t>Second step, read Chapter 3 and draw an use case diagram. You can also review a visual paradigm tutorial on use case diagrams.</w:t>
-      </w:r>
-    </w:p>
-    <w:p/>
-    <w:p>
-      <w:r>
-        <w:t>Third step, review Chapter 5 and use the robustness analysis method to create a Boundary - Entity - Controller diagram. A BCE diagram (called a robustness diagram) is a way of analyzing and identifying which kind of technological objects or interfaces the user works with.</w:t>
-      </w:r>
-    </w:p>
-    <w:p/>
-    <w:p>
-      <w:r>
-        <w:t>Critical advice: Do not make the BCE diagram too complex. For example, you can have a level of detail similar to a diagram describing an ATM (originally by Pearce from SJSU), presented as an example below.</w:t>
-      </w:r>
-    </w:p>
-    <w:p/>
-    <w:p/>
-    <w:p/>
-    <w:p>
-      <w:r>
-        <w:t>Motivation: The author of the book expresses the need for a BCE analysis (also called robustness analysis) as follows: "To get from use cases to detailed design (and then to code), you need to link your use cases to objects. The technique we describe in this chapter, robustness analysis, helps you to bridge the gap from analysis to design by doing exactly that. In a nutshell, it’s a way of analyzing your use case text and identifying a first-guess set of objects for each use case. These are classified into boundary objects, entity objects, and controllers (which are often more like functions than objects)."</w:t>
-      </w:r>
-    </w:p>
-    <w:p/>
-    <w:p>
-      <w:r>
-        <w:t xml:space="preserve"> </w:t>
-      </w:r>
-    </w:p>
-    <w:p/>
-    <w:p>
-      <w:r>
-        <w:t>Case description</w:t>
-      </w:r>
-    </w:p>
-    <w:p/>
-    <w:p>
-      <w:r>
-        <w:t>In this case you and your team are tasked to design an UML design for a single use case from either EnviroSense or AudioNow system.</w:t>
-      </w:r>
-    </w:p>
-    <w:p/>
-    <w:p>
-      <w:r>
-        <w:lastRenderedPageBreak/>
-        <w:t>Select and define one of these use cases from EnviroSense (if you are working on that one): Uploading a sensor observation with hand-held measuring device, triggering a download from all remote sensors that are online, or refreshing an analytics view from the database as a batch process.</w:t>
-      </w:r>
-    </w:p>
-    <w:p/>
-    <w:p>
-      <w:r>
-        <w:t>Select and define one of these use cases from AudioNow (if you are working on that one): Buying physical merchandise, buying a podcast subscription, or joining a shared listening experience online room.</w:t>
-      </w:r>
-    </w:p>
-    <w:p/>
-    <w:p>
-      <w:r>
-        <w:t xml:space="preserve"> </w:t>
-      </w:r>
-    </w:p>
-    <w:p/>
-    <w:p>
-      <w:r>
-        <w:t>Deliverables</w:t>
-      </w:r>
-    </w:p>
-    <w:p/>
-    <w:p>
-      <w:r>
-        <w:t>Following the instructions above, draw a 1) simplified domain model, 2) use case diagram, and 3) BCE diagram (robustness diagram). Describe the design rationale and what happens in each diagram in your own words. Use complete sentences, add captions to your figures, and pay attention to flow and readability of your report.</w:t>
-      </w:r>
-    </w:p>
-    <w:p/>
-    <w:p>
-      <w:r>
-        <w:t>Return this work as a single PDF file into Moodle.</w:t>
-      </w:r>
-    </w:p>
-    <w:p/>
-    <w:p/>
-    <w:p>
-      <w:r>
-        <w:t>Include the Declaration of AI Use at the end of the assignment. The declaration is required for grading the work whether you used AI tools or not.</w:t>
-      </w:r>
-    </w:p>
-    <w:p/>
-    <w:p/>
-    <w:p>
-      <w:r>
-        <w:t>Declaration of AI Use</w:t>
-      </w:r>
-    </w:p>
-    <w:p/>
-    <w:p>
-      <w:r>
-        <w:t>In a separate chapter at the end of the document, list the following.</w:t>
-      </w:r>
-    </w:p>
-    <w:p/>
-    <w:p>
-      <w:r>
-        <w:t>1) Name all AI systems that were used in the development of the contents of this document, and for each</w:t>
-      </w:r>
-    </w:p>
-    <w:p/>
-    <w:p>
-      <w:r>
-        <w:t>2) How and where they were used (illustrations, proofreading, getting ideas for text, to generate diagrams etc.) or</w:t>
-      </w:r>
-    </w:p>
-    <w:p/>
-    <w:p>
-      <w:r>
-        <w:t>3) Clearly state that no AI assistance or tools were used in this assignment.</w:t>
-      </w:r>
-    </w:p>
-    <w:p/>
-    <w:p>
-      <w:r>
-        <w:t>This Declaration is mandatory part of the submission and leaving it out means that the work is incomplete and should not be graded. Declaring that no AI was used in the development of the document, but getting high number in TurnItIn AI check is also a valid grounds for failing the work just by itself.</w:t>
-      </w:r>
+      <w:r>
+        <w:rPr>
+          <w:lang w:val="en-US"/>
+        </w:rPr>
+        <w:t>t</w:t>
+      </w:r>
+      <w:r>
+        <w:rPr>
+          <w:lang w:val="en-US"/>
+        </w:rPr>
+        <w:t>o get a grasp idea of Use case diagram and BCE diagram</w:t>
+      </w:r>
+      <w:r>
+        <w:rPr>
+          <w:lang w:val="en-US"/>
+        </w:rPr>
+        <w:t>.</w:t>
+      </w:r>
+    </w:p>
+    <w:p>
+      <w:pPr>
+        <w:pStyle w:val="Normal"/>
+        <w:suppressLineNumbers w:val="0"/>
+        <w:bidi w:val="0"/>
+        <w:spacing w:before="0" w:beforeAutospacing="off" w:after="160" w:afterAutospacing="off" w:line="278" w:lineRule="auto"/>
+        <w:ind w:left="0" w:right="0"/>
+        <w:jc w:val="left"/>
+        <w:rPr>
+          <w:lang w:val="en-US"/>
+        </w:rPr>
+      </w:pPr>
+    </w:p>
+    <w:p>
+      <w:pPr>
+        <w:pStyle w:val="Heading2"/>
+      </w:pPr>
+      <w:r>
+        <w:rPr>
+          <w:lang w:val="en-US"/>
+        </w:rPr>
+        <w:t>References</w:t>
+      </w:r>
+    </w:p>
+    <w:p>
+      <w:pPr>
+        <w:pStyle w:val="Normal"/>
+      </w:pPr>
+      <w:r>
+        <w:rPr>
+          <w:lang w:val="en-US"/>
+        </w:rPr>
+        <w:t xml:space="preserve">Use Case Driven Object Modeling with UML. (2007). Apress. </w:t>
+      </w:r>
+      <w:hyperlink r:id="R7c63126e5336409d">
+        <w:r>
+          <w:rPr>
+            <w:rStyle w:val="Hyperlink"/>
+            <w:lang w:val="en-US"/>
+          </w:rPr>
+          <w:t>https://doi.org/10.1007/978-1-4302-0369-8</w:t>
+        </w:r>
+      </w:hyperlink>
+    </w:p>
+    <w:p>
+      <w:pPr>
+        <w:pStyle w:val="Normal"/>
+      </w:pPr>
+      <w:r>
+        <w:rPr>
+          <w:lang w:val="en-US"/>
+        </w:rPr>
+        <w:t xml:space="preserve">Fowler, M. (2018). UML </w:t>
+      </w:r>
+      <w:r>
+        <w:rPr>
+          <w:lang w:val="en-US"/>
+        </w:rPr>
+        <w:t>distilled :</w:t>
+      </w:r>
+      <w:r>
+        <w:rPr>
+          <w:lang w:val="en-US"/>
+        </w:rPr>
+        <w:t xml:space="preserve"> a brief guide to the standard object modeling language. </w:t>
+      </w:r>
+      <w:r>
+        <w:rPr>
+          <w:lang w:val="en-US"/>
+        </w:rPr>
+        <w:t>Addison-Wesley</w:t>
+      </w:r>
+      <w:r>
+        <w:rPr>
+          <w:lang w:val="en-US"/>
+        </w:rPr>
+        <w:t>.</w:t>
+      </w:r>
+    </w:p>
+    <w:p>
+      <w:pPr>
+        <w:pStyle w:val="Normal"/>
+      </w:pPr>
+      <w:r>
+        <w:rPr>
+          <w:lang w:val="en-US"/>
+        </w:rPr>
+        <w:t xml:space="preserve">Visual Paradigm. (2019). What is </w:t>
+      </w:r>
+      <w:r>
+        <w:rPr>
+          <w:lang w:val="en-US"/>
+        </w:rPr>
+        <w:t>Use</w:t>
+      </w:r>
+      <w:r>
+        <w:rPr>
+          <w:lang w:val="en-US"/>
+        </w:rPr>
+        <w:t xml:space="preserve"> Case Diagram? Visual-</w:t>
+      </w:r>
+      <w:r>
+        <w:rPr>
+          <w:lang w:val="en-US"/>
+        </w:rPr>
+        <w:t>Paradigm.Com</w:t>
+      </w:r>
+      <w:r>
+        <w:rPr>
+          <w:lang w:val="en-US"/>
+        </w:rPr>
+        <w:t xml:space="preserve">. </w:t>
+      </w:r>
+      <w:hyperlink r:id="Rab9ee17008384f83">
+        <w:r>
+          <w:rPr>
+            <w:rStyle w:val="Hyperlink"/>
+            <w:lang w:val="en-US"/>
+          </w:rPr>
+          <w:t>https://www.visual-paradigm.com/guide/uml-unified-modeling-language/what-is-use-case-diagram/</w:t>
+        </w:r>
+      </w:hyperlink>
+    </w:p>
+    <w:p>
+      <w:pPr>
+        <w:pStyle w:val="Normal"/>
+      </w:pPr>
+      <w:r>
+        <w:rPr>
+          <w:lang w:val="en-US"/>
+        </w:rPr>
+        <w:t>A Practical Tutorial on Robustness Analysis. (2026). Visual-</w:t>
+      </w:r>
+      <w:r>
+        <w:rPr>
+          <w:lang w:val="en-US"/>
+        </w:rPr>
+        <w:t>Paradigm.Com</w:t>
+      </w:r>
+      <w:r>
+        <w:rPr>
+          <w:lang w:val="en-US"/>
+        </w:rPr>
+        <w:t xml:space="preserve">. </w:t>
+      </w:r>
+      <w:hyperlink r:id="Rcb5f67e53fd64801">
+        <w:r>
+          <w:rPr>
+            <w:rStyle w:val="Hyperlink"/>
+            <w:lang w:val="en-US"/>
+          </w:rPr>
+          <w:t>https://www.visual-paradigm.com/guide/uml-unified-modeling-language/robustness-analysis-tutorial/1000</w:t>
+        </w:r>
+      </w:hyperlink>
+    </w:p>
+    <w:p>
+      <w:pPr>
+        <w:pStyle w:val="Normal"/>
+        <w:rPr>
+          <w:lang w:val="en-US"/>
+        </w:rPr>
+      </w:pPr>
     </w:p>
     <w:sectPr>
-      <w:pgSz w:w="11906" w:h="16838"/>
+      <w:pgSz w:w="11906" w:h="16838" w:orient="portrait"/>
       <w:pgMar w:top="1440" w:right="1440" w:bottom="1440" w:left="1440" w:header="708" w:footer="708" w:gutter="0"/>
       <w:cols w:space="708"/>
       <w:docGrid w:linePitch="360"/>
@@ -673,7 +1133,7 @@
   <w:docDefaults>
     <w:rPrDefault>
       <w:rPr>
-        <w:rFonts w:asciiTheme="minorHAnsi" w:eastAsiaTheme="minorEastAsia" w:hAnsiTheme="minorHAnsi" w:cstheme="minorBidi"/>
+        <w:rFonts w:asciiTheme="minorHAnsi" w:hAnsiTheme="minorHAnsi" w:eastAsiaTheme="minorEastAsia" w:cstheme="minorBidi"/>
         <w:kern w:val="2"/>
         <w:sz w:val="24"/>
         <w:szCs w:val="24"/>
@@ -690,14 +1150,14 @@
   <w:latentStyles w:defLockedState="0" w:defUIPriority="99" w:defSemiHidden="0" w:defUnhideWhenUsed="0" w:defQFormat="0" w:count="376">
     <w:lsdException w:name="Normal" w:uiPriority="0" w:qFormat="1"/>
     <w:lsdException w:name="heading 1" w:uiPriority="9" w:qFormat="1"/>
-    <w:lsdException w:name="heading 2" w:semiHidden="1" w:uiPriority="9" w:unhideWhenUsed="1" w:qFormat="1"/>
-    <w:lsdException w:name="heading 3" w:semiHidden="1" w:uiPriority="9" w:unhideWhenUsed="1" w:qFormat="1"/>
-    <w:lsdException w:name="heading 4" w:semiHidden="1" w:uiPriority="9" w:unhideWhenUsed="1" w:qFormat="1"/>
-    <w:lsdException w:name="heading 5" w:semiHidden="1" w:uiPriority="9" w:unhideWhenUsed="1" w:qFormat="1"/>
-    <w:lsdException w:name="heading 6" w:semiHidden="1" w:uiPriority="9" w:unhideWhenUsed="1" w:qFormat="1"/>
-    <w:lsdException w:name="heading 7" w:semiHidden="1" w:uiPriority="9" w:unhideWhenUsed="1" w:qFormat="1"/>
-    <w:lsdException w:name="heading 8" w:semiHidden="1" w:uiPriority="9" w:unhideWhenUsed="1" w:qFormat="1"/>
-    <w:lsdException w:name="heading 9" w:semiHidden="1" w:uiPriority="9" w:unhideWhenUsed="1" w:qFormat="1"/>
+    <w:lsdException w:name="heading 2" w:uiPriority="9" w:semiHidden="1" w:unhideWhenUsed="1" w:qFormat="1"/>
+    <w:lsdException w:name="heading 3" w:uiPriority="9" w:semiHidden="1" w:unhideWhenUsed="1" w:qFormat="1"/>
+    <w:lsdException w:name="heading 4" w:uiPriority="9" w:semiHidden="1" w:unhideWhenUsed="1" w:qFormat="1"/>
+    <w:lsdException w:name="heading 5" w:uiPriority="9" w:semiHidden="1" w:unhideWhenUsed="1" w:qFormat="1"/>
+    <w:lsdException w:name="heading 6" w:uiPriority="9" w:semiHidden="1" w:unhideWhenUsed="1" w:qFormat="1"/>
+    <w:lsdException w:name="heading 7" w:uiPriority="9" w:semiHidden="1" w:unhideWhenUsed="1" w:qFormat="1"/>
+    <w:lsdException w:name="heading 8" w:uiPriority="9" w:semiHidden="1" w:unhideWhenUsed="1" w:qFormat="1"/>
+    <w:lsdException w:name="heading 9" w:uiPriority="9" w:semiHidden="1" w:unhideWhenUsed="1" w:qFormat="1"/>
     <w:lsdException w:name="index 1" w:semiHidden="1" w:unhideWhenUsed="1"/>
     <w:lsdException w:name="index 2" w:semiHidden="1" w:unhideWhenUsed="1"/>
     <w:lsdException w:name="index 3" w:semiHidden="1" w:unhideWhenUsed="1"/>
@@ -707,22 +1167,22 @@
     <w:lsdException w:name="index 7" w:semiHidden="1" w:unhideWhenUsed="1"/>
     <w:lsdException w:name="index 8" w:semiHidden="1" w:unhideWhenUsed="1"/>
     <w:lsdException w:name="index 9" w:semiHidden="1" w:unhideWhenUsed="1"/>
-    <w:lsdException w:name="toc 1" w:semiHidden="1" w:uiPriority="39" w:unhideWhenUsed="1"/>
-    <w:lsdException w:name="toc 2" w:semiHidden="1" w:uiPriority="39" w:unhideWhenUsed="1"/>
-    <w:lsdException w:name="toc 3" w:semiHidden="1" w:uiPriority="39" w:unhideWhenUsed="1"/>
-    <w:lsdException w:name="toc 4" w:semiHidden="1" w:uiPriority="39" w:unhideWhenUsed="1"/>
-    <w:lsdException w:name="toc 5" w:semiHidden="1" w:uiPriority="39" w:unhideWhenUsed="1"/>
-    <w:lsdException w:name="toc 6" w:semiHidden="1" w:uiPriority="39" w:unhideWhenUsed="1"/>
-    <w:lsdException w:name="toc 7" w:semiHidden="1" w:uiPriority="39" w:unhideWhenUsed="1"/>
-    <w:lsdException w:name="toc 8" w:semiHidden="1" w:uiPriority="39" w:unhideWhenUsed="1"/>
-    <w:lsdException w:name="toc 9" w:semiHidden="1" w:uiPriority="39" w:unhideWhenUsed="1"/>
+    <w:lsdException w:name="toc 1" w:uiPriority="39" w:semiHidden="1" w:unhideWhenUsed="1"/>
+    <w:lsdException w:name="toc 2" w:uiPriority="39" w:semiHidden="1" w:unhideWhenUsed="1"/>
+    <w:lsdException w:name="toc 3" w:uiPriority="39" w:semiHidden="1" w:unhideWhenUsed="1"/>
+    <w:lsdException w:name="toc 4" w:uiPriority="39" w:semiHidden="1" w:unhideWhenUsed="1"/>
+    <w:lsdException w:name="toc 5" w:uiPriority="39" w:semiHidden="1" w:unhideWhenUsed="1"/>
+    <w:lsdException w:name="toc 6" w:uiPriority="39" w:semiHidden="1" w:unhideWhenUsed="1"/>
+    <w:lsdException w:name="toc 7" w:uiPriority="39" w:semiHidden="1" w:unhideWhenUsed="1"/>
+    <w:lsdException w:name="toc 8" w:uiPriority="39" w:semiHidden="1" w:unhideWhenUsed="1"/>
+    <w:lsdException w:name="toc 9" w:uiPriority="39" w:semiHidden="1" w:unhideWhenUsed="1"/>
     <w:lsdException w:name="Normal Indent" w:semiHidden="1" w:unhideWhenUsed="1"/>
     <w:lsdException w:name="footnote text" w:semiHidden="1" w:unhideWhenUsed="1"/>
     <w:lsdException w:name="annotation text" w:semiHidden="1" w:unhideWhenUsed="1"/>
     <w:lsdException w:name="header" w:semiHidden="1" w:unhideWhenUsed="1"/>
     <w:lsdException w:name="footer" w:semiHidden="1" w:unhideWhenUsed="1"/>
     <w:lsdException w:name="index heading" w:semiHidden="1" w:unhideWhenUsed="1"/>
-    <w:lsdException w:name="caption" w:semiHidden="1" w:uiPriority="35" w:unhideWhenUsed="1" w:qFormat="1"/>
+    <w:lsdException w:name="caption" w:uiPriority="35" w:semiHidden="1" w:unhideWhenUsed="1" w:qFormat="1"/>
     <w:lsdException w:name="table of figures" w:semiHidden="1" w:unhideWhenUsed="1"/>
     <w:lsdException w:name="envelope address" w:semiHidden="1" w:unhideWhenUsed="1"/>
     <w:lsdException w:name="envelope return" w:semiHidden="1" w:unhideWhenUsed="1"/>
@@ -753,7 +1213,7 @@
     <w:lsdException w:name="Title" w:uiPriority="10" w:qFormat="1"/>
     <w:lsdException w:name="Closing" w:semiHidden="1" w:unhideWhenUsed="1"/>
     <w:lsdException w:name="Signature" w:semiHidden="1" w:unhideWhenUsed="1"/>
-    <w:lsdException w:name="Default Paragraph Font" w:semiHidden="1" w:uiPriority="1" w:unhideWhenUsed="1"/>
+    <w:lsdException w:name="Default Paragraph Font" w:uiPriority="1" w:semiHidden="1" w:unhideWhenUsed="1"/>
     <w:lsdException w:name="Body Text" w:semiHidden="1" w:unhideWhenUsed="1"/>
     <w:lsdException w:name="Body Text Indent" w:semiHidden="1" w:unhideWhenUsed="1"/>
     <w:lsdException w:name="List Continue" w:semiHidden="1" w:unhideWhenUsed="1"/>
@@ -953,8 +1413,8 @@
     <w:lsdException w:name="Subtle Reference" w:uiPriority="31" w:qFormat="1"/>
     <w:lsdException w:name="Intense Reference" w:uiPriority="32" w:qFormat="1"/>
     <w:lsdException w:name="Book Title" w:uiPriority="33" w:qFormat="1"/>
-    <w:lsdException w:name="Bibliography" w:semiHidden="1" w:uiPriority="37" w:unhideWhenUsed="1"/>
-    <w:lsdException w:name="TOC Heading" w:semiHidden="1" w:uiPriority="39" w:unhideWhenUsed="1" w:qFormat="1"/>
+    <w:lsdException w:name="Bibliography" w:uiPriority="37" w:semiHidden="1" w:unhideWhenUsed="1"/>
+    <w:lsdException w:name="TOC Heading" w:uiPriority="39" w:semiHidden="1" w:unhideWhenUsed="1" w:qFormat="1"/>
     <w:lsdException w:name="Plain Table 1" w:uiPriority="41"/>
     <w:lsdException w:name="Plain Table 2" w:uiPriority="42"/>
     <w:lsdException w:name="Plain Table 3" w:uiPriority="43"/>
@@ -1065,7 +1525,7 @@
     <w:lsdException w:name="Unresolved Mention" w:semiHidden="1" w:unhideWhenUsed="1"/>
     <w:lsdException w:name="Smart Link" w:semiHidden="1" w:unhideWhenUsed="1"/>
   </w:latentStyles>
-  <w:style w:type="paragraph" w:default="1" w:styleId="Normal">
+  <w:style w:type="paragraph" w:styleId="Normal" w:default="1">
     <w:name w:val="Normal"/>
     <w:qFormat/>
   </w:style>
@@ -1084,7 +1544,7 @@
       <w:outlineLvl w:val="0"/>
     </w:pPr>
     <w:rPr>
-      <w:rFonts w:asciiTheme="majorHAnsi" w:eastAsiaTheme="majorEastAsia" w:hAnsiTheme="majorHAnsi" w:cstheme="majorBidi"/>
+      <w:rFonts w:asciiTheme="majorHAnsi" w:hAnsiTheme="majorHAnsi" w:eastAsiaTheme="majorEastAsia" w:cstheme="majorBidi"/>
       <w:color w:val="0F4761" w:themeColor="accent1" w:themeShade="BF"/>
       <w:sz w:val="40"/>
       <w:szCs w:val="40"/>
@@ -1107,7 +1567,7 @@
       <w:outlineLvl w:val="1"/>
     </w:pPr>
     <w:rPr>
-      <w:rFonts w:asciiTheme="majorHAnsi" w:eastAsiaTheme="majorEastAsia" w:hAnsiTheme="majorHAnsi" w:cstheme="majorBidi"/>
+      <w:rFonts w:asciiTheme="majorHAnsi" w:hAnsiTheme="majorHAnsi" w:eastAsiaTheme="majorEastAsia" w:cstheme="majorBidi"/>
       <w:color w:val="0F4761" w:themeColor="accent1" w:themeShade="BF"/>
       <w:sz w:val="32"/>
       <w:szCs w:val="32"/>
@@ -1268,13 +1728,13 @@
       <w:color w:val="272727" w:themeColor="text1" w:themeTint="D8"/>
     </w:rPr>
   </w:style>
-  <w:style w:type="character" w:default="1" w:styleId="DefaultParagraphFont">
+  <w:style w:type="character" w:styleId="DefaultParagraphFont" w:default="1">
     <w:name w:val="Default Paragraph Font"/>
     <w:uiPriority w:val="1"/>
     <w:semiHidden/>
     <w:unhideWhenUsed/>
   </w:style>
-  <w:style w:type="table" w:default="1" w:styleId="TableNormal">
+  <w:style w:type="table" w:styleId="TableNormal" w:default="1">
     <w:name w:val="Normal Table"/>
     <w:uiPriority w:val="99"/>
     <w:semiHidden/>
@@ -1289,26 +1749,26 @@
       </w:tblCellMar>
     </w:tblPr>
   </w:style>
-  <w:style w:type="numbering" w:default="1" w:styleId="NoList">
+  <w:style w:type="numbering" w:styleId="NoList" w:default="1">
     <w:name w:val="No List"/>
     <w:uiPriority w:val="99"/>
     <w:semiHidden/>
     <w:unhideWhenUsed/>
   </w:style>
-  <w:style w:type="character" w:customStyle="1" w:styleId="Heading1Char">
+  <w:style w:type="character" w:styleId="Heading1Char" w:customStyle="1">
     <w:name w:val="Heading 1 Char"/>
     <w:basedOn w:val="DefaultParagraphFont"/>
     <w:link w:val="Heading1"/>
     <w:uiPriority w:val="9"/>
     <w:rsid w:val="00612C54"/>
     <w:rPr>
-      <w:rFonts w:asciiTheme="majorHAnsi" w:eastAsiaTheme="majorEastAsia" w:hAnsiTheme="majorHAnsi" w:cstheme="majorBidi"/>
+      <w:rFonts w:asciiTheme="majorHAnsi" w:hAnsiTheme="majorHAnsi" w:eastAsiaTheme="majorEastAsia" w:cstheme="majorBidi"/>
       <w:color w:val="0F4761" w:themeColor="accent1" w:themeShade="BF"/>
       <w:sz w:val="40"/>
       <w:szCs w:val="40"/>
     </w:rPr>
   </w:style>
-  <w:style w:type="character" w:customStyle="1" w:styleId="Heading2Char">
+  <w:style w:type="character" w:styleId="Heading2Char" w:customStyle="1">
     <w:name w:val="Heading 2 Char"/>
     <w:basedOn w:val="DefaultParagraphFont"/>
     <w:link w:val="Heading2"/>
@@ -1316,13 +1776,13 @@
     <w:semiHidden/>
     <w:rsid w:val="00612C54"/>
     <w:rPr>
-      <w:rFonts w:asciiTheme="majorHAnsi" w:eastAsiaTheme="majorEastAsia" w:hAnsiTheme="majorHAnsi" w:cstheme="majorBidi"/>
+      <w:rFonts w:asciiTheme="majorHAnsi" w:hAnsiTheme="majorHAnsi" w:eastAsiaTheme="majorEastAsia" w:cstheme="majorBidi"/>
       <w:color w:val="0F4761" w:themeColor="accent1" w:themeShade="BF"/>
       <w:sz w:val="32"/>
       <w:szCs w:val="32"/>
     </w:rPr>
   </w:style>
-  <w:style w:type="character" w:customStyle="1" w:styleId="Heading3Char">
+  <w:style w:type="character" w:styleId="Heading3Char" w:customStyle="1">
     <w:name w:val="Heading 3 Char"/>
     <w:basedOn w:val="DefaultParagraphFont"/>
     <w:link w:val="Heading3"/>
@@ -1336,7 +1796,7 @@
       <w:szCs w:val="28"/>
     </w:rPr>
   </w:style>
-  <w:style w:type="character" w:customStyle="1" w:styleId="Heading4Char">
+  <w:style w:type="character" w:styleId="Heading4Char" w:customStyle="1">
     <w:name w:val="Heading 4 Char"/>
     <w:basedOn w:val="DefaultParagraphFont"/>
     <w:link w:val="Heading4"/>
@@ -1350,7 +1810,7 @@
       <w:color w:val="0F4761" w:themeColor="accent1" w:themeShade="BF"/>
     </w:rPr>
   </w:style>
-  <w:style w:type="character" w:customStyle="1" w:styleId="Heading5Char">
+  <w:style w:type="character" w:styleId="Heading5Char" w:customStyle="1">
     <w:name w:val="Heading 5 Char"/>
     <w:basedOn w:val="DefaultParagraphFont"/>
     <w:link w:val="Heading5"/>
@@ -1362,7 +1822,7 @@
       <w:color w:val="0F4761" w:themeColor="accent1" w:themeShade="BF"/>
     </w:rPr>
   </w:style>
-  <w:style w:type="character" w:customStyle="1" w:styleId="Heading6Char">
+  <w:style w:type="character" w:styleId="Heading6Char" w:customStyle="1">
     <w:name w:val="Heading 6 Char"/>
     <w:basedOn w:val="DefaultParagraphFont"/>
     <w:link w:val="Heading6"/>
@@ -1376,7 +1836,7 @@
       <w:color w:val="595959" w:themeColor="text1" w:themeTint="A6"/>
     </w:rPr>
   </w:style>
-  <w:style w:type="character" w:customStyle="1" w:styleId="Heading7Char">
+  <w:style w:type="character" w:styleId="Heading7Char" w:customStyle="1">
     <w:name w:val="Heading 7 Char"/>
     <w:basedOn w:val="DefaultParagraphFont"/>
     <w:link w:val="Heading7"/>
@@ -1388,7 +1848,7 @@
       <w:color w:val="595959" w:themeColor="text1" w:themeTint="A6"/>
     </w:rPr>
   </w:style>
-  <w:style w:type="character" w:customStyle="1" w:styleId="Heading8Char">
+  <w:style w:type="character" w:styleId="Heading8Char" w:customStyle="1">
     <w:name w:val="Heading 8 Char"/>
     <w:basedOn w:val="DefaultParagraphFont"/>
     <w:link w:val="Heading8"/>
@@ -1402,7 +1862,7 @@
       <w:color w:val="272727" w:themeColor="text1" w:themeTint="D8"/>
     </w:rPr>
   </w:style>
-  <w:style w:type="character" w:customStyle="1" w:styleId="Heading9Char">
+  <w:style w:type="character" w:styleId="Heading9Char" w:customStyle="1">
     <w:name w:val="Heading 9 Char"/>
     <w:basedOn w:val="DefaultParagraphFont"/>
     <w:link w:val="Heading9"/>
@@ -1427,21 +1887,21 @@
       <w:contextualSpacing/>
     </w:pPr>
     <w:rPr>
-      <w:rFonts w:asciiTheme="majorHAnsi" w:eastAsiaTheme="majorEastAsia" w:hAnsiTheme="majorHAnsi" w:cstheme="majorBidi"/>
+      <w:rFonts w:asciiTheme="majorHAnsi" w:hAnsiTheme="majorHAnsi" w:eastAsiaTheme="majorEastAsia" w:cstheme="majorBidi"/>
       <w:spacing w:val="-10"/>
       <w:kern w:val="28"/>
       <w:sz w:val="56"/>
       <w:szCs w:val="56"/>
     </w:rPr>
   </w:style>
-  <w:style w:type="character" w:customStyle="1" w:styleId="TitleChar">
+  <w:style w:type="character" w:styleId="TitleChar" w:customStyle="1">
     <w:name w:val="Title Char"/>
     <w:basedOn w:val="DefaultParagraphFont"/>
     <w:link w:val="Title"/>
     <w:uiPriority w:val="10"/>
     <w:rsid w:val="00612C54"/>
     <w:rPr>
-      <w:rFonts w:asciiTheme="majorHAnsi" w:eastAsiaTheme="majorEastAsia" w:hAnsiTheme="majorHAnsi" w:cstheme="majorBidi"/>
+      <w:rFonts w:asciiTheme="majorHAnsi" w:hAnsiTheme="majorHAnsi" w:eastAsiaTheme="majorEastAsia" w:cstheme="majorBidi"/>
       <w:spacing w:val="-10"/>
       <w:kern w:val="28"/>
       <w:sz w:val="56"/>
@@ -1469,7 +1929,7 @@
       <w:szCs w:val="28"/>
     </w:rPr>
   </w:style>
-  <w:style w:type="character" w:customStyle="1" w:styleId="SubtitleChar">
+  <w:style w:type="character" w:styleId="SubtitleChar" w:customStyle="1">
     <w:name w:val="Subtitle Char"/>
     <w:basedOn w:val="DefaultParagraphFont"/>
     <w:link w:val="Subtitle"/>
@@ -1501,7 +1961,7 @@
       <w:color w:val="404040" w:themeColor="text1" w:themeTint="BF"/>
     </w:rPr>
   </w:style>
-  <w:style w:type="character" w:customStyle="1" w:styleId="QuoteChar">
+  <w:style w:type="character" w:styleId="QuoteChar" w:customStyle="1">
     <w:name w:val="Quote Char"/>
     <w:basedOn w:val="DefaultParagraphFont"/>
     <w:link w:val="Quote"/>
@@ -1546,8 +2006,8 @@
     <w:rsid w:val="00612C54"/>
     <w:pPr>
       <w:pBdr>
-        <w:top w:val="single" w:sz="4" w:space="10" w:color="0F4761" w:themeColor="accent1" w:themeShade="BF"/>
-        <w:bottom w:val="single" w:sz="4" w:space="10" w:color="0F4761" w:themeColor="accent1" w:themeShade="BF"/>
+        <w:top w:val="single" w:color="0F4761" w:themeColor="accent1" w:themeShade="BF" w:sz="4" w:space="10"/>
+        <w:bottom w:val="single" w:color="0F4761" w:themeColor="accent1" w:themeShade="BF" w:sz="4" w:space="10"/>
       </w:pBdr>
       <w:spacing w:before="360" w:after="360"/>
       <w:ind w:left="864" w:right="864"/>
@@ -1559,7 +2019,7 @@
       <w:color w:val="0F4761" w:themeColor="accent1" w:themeShade="BF"/>
     </w:rPr>
   </w:style>
-  <w:style w:type="character" w:customStyle="1" w:styleId="IntenseQuoteChar">
+  <w:style w:type="character" w:styleId="IntenseQuoteChar" w:customStyle="1">
     <w:name w:val="Intense Quote Char"/>
     <w:basedOn w:val="DefaultParagraphFont"/>
     <w:link w:val="IntenseQuote"/>
@@ -1585,11 +2045,22 @@
       <w:spacing w:val="5"/>
     </w:rPr>
   </w:style>
+  <w:style w:type="character" w:styleId="Hyperlink">
+    <w:uiPriority w:val="99"/>
+    <w:name w:val="Hyperlink"/>
+    <w:basedOn w:val="DefaultParagraphFont"/>
+    <w:unhideWhenUsed/>
+    <w:rsid w:val="42336FD9"/>
+    <w:rPr>
+      <w:color w:val="467886"/>
+      <w:u w:val="single"/>
+    </w:rPr>
+  </w:style>
 </w:styles>
 </file>
 
 <file path=word/theme/theme1.xml><?xml version="1.0" encoding="utf-8"?>
-<a:theme xmlns:a="http://schemas.openxmlformats.org/drawingml/2006/main" name="Office Theme">
+<a:theme xmlns:a="http://schemas.openxmlformats.org/drawingml/2006/main" xmlns:thm15="http://schemas.microsoft.com/office/thememl/2012/main" name="Office Theme">
   <a:themeElements>
     <a:clrScheme name="Office">
       <a:dk1>

</xml_diff>